<commit_message>
with udp checkum validation and test
</commit_message>
<xml_diff>
--- a/reference/RFC7348_VXLAN_Implementation_Status.docx
+++ b/reference/RFC7348_VXLAN_Implementation_Status.docx
@@ -1218,25 +1218,7 @@
                 <w:sz w:val="16"/>
                 <w:szCs w:val="16"/>
               </w:rPr>
-              <w:t xml:space="preserve">UDP </w:t>
-            </w:r>
-            <w:proofErr w:type="spellStart"/>
-            <w:r>
-              <w:rPr>
-                <w:rFonts w:ascii="Arial" w:hAnsi="Arial" w:cs="Arial"/>
-                <w:sz w:val="16"/>
-                <w:szCs w:val="16"/>
-              </w:rPr>
-              <w:t>dest</w:t>
-            </w:r>
-            <w:proofErr w:type="spellEnd"/>
-            <w:r>
-              <w:rPr>
-                <w:rFonts w:ascii="Arial" w:hAnsi="Arial" w:cs="Arial"/>
-                <w:sz w:val="16"/>
-                <w:szCs w:val="16"/>
-              </w:rPr>
-              <w:t xml:space="preserve"> port SHOULD be 4789 (IANA assigned)</w:t>
+              <w:t>UDP dest port SHOULD be 4789 (IANA assigned)</w:t>
             </w:r>
           </w:p>
         </w:tc>
@@ -1395,25 +1377,7 @@
                 <w:sz w:val="16"/>
                 <w:szCs w:val="16"/>
               </w:rPr>
-              <w:t xml:space="preserve">UDP </w:t>
-            </w:r>
-            <w:proofErr w:type="spellStart"/>
-            <w:r>
-              <w:rPr>
-                <w:rFonts w:ascii="Arial" w:hAnsi="Arial" w:cs="Arial"/>
-                <w:sz w:val="16"/>
-                <w:szCs w:val="16"/>
-              </w:rPr>
-              <w:t>dest</w:t>
-            </w:r>
-            <w:proofErr w:type="spellEnd"/>
-            <w:r>
-              <w:rPr>
-                <w:rFonts w:ascii="Arial" w:hAnsi="Arial" w:cs="Arial"/>
-                <w:sz w:val="16"/>
-                <w:szCs w:val="16"/>
-              </w:rPr>
-              <w:t xml:space="preserve"> port SHOULD be configurable</w:t>
+              <w:t>UDP dest port SHOULD be configurable</w:t>
             </w:r>
           </w:p>
         </w:tc>
@@ -1572,25 +1536,7 @@
                 <w:sz w:val="16"/>
                 <w:szCs w:val="16"/>
               </w:rPr>
-              <w:t xml:space="preserve">UDP </w:t>
-            </w:r>
-            <w:proofErr w:type="spellStart"/>
-            <w:r>
-              <w:rPr>
-                <w:rFonts w:ascii="Arial" w:hAnsi="Arial" w:cs="Arial"/>
-                <w:sz w:val="16"/>
-                <w:szCs w:val="16"/>
-              </w:rPr>
-              <w:t>src</w:t>
-            </w:r>
-            <w:proofErr w:type="spellEnd"/>
-            <w:r>
-              <w:rPr>
-                <w:rFonts w:ascii="Arial" w:hAnsi="Arial" w:cs="Arial"/>
-                <w:sz w:val="16"/>
-                <w:szCs w:val="16"/>
-              </w:rPr>
-              <w:t xml:space="preserve"> port RECOMMENDED to be hash of inner frame</w:t>
+              <w:t>UDP src port RECOMMENDED to be hash of inner frame</w:t>
             </w:r>
           </w:p>
         </w:tc>
@@ -1749,25 +1695,7 @@
                 <w:sz w:val="16"/>
                 <w:szCs w:val="16"/>
               </w:rPr>
-              <w:t xml:space="preserve">UDP </w:t>
-            </w:r>
-            <w:proofErr w:type="spellStart"/>
-            <w:r>
-              <w:rPr>
-                <w:rFonts w:ascii="Arial" w:hAnsi="Arial" w:cs="Arial"/>
-                <w:sz w:val="16"/>
-                <w:szCs w:val="16"/>
-              </w:rPr>
-              <w:t>src</w:t>
-            </w:r>
-            <w:proofErr w:type="spellEnd"/>
-            <w:r>
-              <w:rPr>
-                <w:rFonts w:ascii="Arial" w:hAnsi="Arial" w:cs="Arial"/>
-                <w:sz w:val="16"/>
-                <w:szCs w:val="16"/>
-              </w:rPr>
-              <w:t xml:space="preserve"> port RECOMMENDED in range 49152-65535</w:t>
+              <w:t>UDP src port RECOMMENDED in range 49152-65535</w:t>
             </w:r>
           </w:p>
         </w:tc>
@@ -2644,7 +2572,7 @@
                 <w:sz w:val="16"/>
                 <w:szCs w:val="16"/>
               </w:rPr>
-              <w:t>NO</w:t>
+              <w:t>YES</w:t>
             </w:r>
           </w:p>
         </w:tc>
@@ -2665,14 +2593,6 @@
                 <w:szCs w:val="16"/>
               </w:rPr>
             </w:pPr>
-            <w:r>
-              <w:rPr>
-                <w:rFonts w:ascii="Arial" w:hAnsi="Arial" w:cs="Arial"/>
-                <w:sz w:val="16"/>
-                <w:szCs w:val="16"/>
-              </w:rPr>
-              <w:t>Not enforced in current implementation</w:t>
-            </w:r>
           </w:p>
         </w:tc>
       </w:tr>
@@ -3053,23 +2973,13 @@
                 <w:szCs w:val="16"/>
               </w:rPr>
             </w:pPr>
-            <w:proofErr w:type="spellStart"/>
-            <w:r>
-              <w:rPr>
-                <w:rFonts w:ascii="Arial" w:hAnsi="Arial" w:cs="Arial"/>
-                <w:sz w:val="16"/>
-                <w:szCs w:val="16"/>
-              </w:rPr>
-              <w:t>Dest</w:t>
-            </w:r>
-            <w:proofErr w:type="spellEnd"/>
-            <w:r>
-              <w:rPr>
-                <w:rFonts w:ascii="Arial" w:hAnsi="Arial" w:cs="Arial"/>
-                <w:sz w:val="16"/>
-                <w:szCs w:val="16"/>
-              </w:rPr>
-              <w:t xml:space="preserve"> VTEP MAY silently discard fragments</w:t>
+            <w:r>
+              <w:rPr>
+                <w:rFonts w:ascii="Arial" w:hAnsi="Arial" w:cs="Arial"/>
+                <w:sz w:val="16"/>
+                <w:szCs w:val="16"/>
+              </w:rPr>
+              <w:t>Dest VTEP MAY silently discard fragments</w:t>
             </w:r>
           </w:p>
         </w:tc>
@@ -3575,43 +3485,7 @@
                 <w:sz w:val="16"/>
                 <w:szCs w:val="16"/>
               </w:rPr>
-              <w:t xml:space="preserve">Learn </w:t>
-            </w:r>
-            <w:proofErr w:type="spellStart"/>
-            <w:r>
-              <w:rPr>
-                <w:rFonts w:ascii="Arial" w:hAnsi="Arial" w:cs="Arial"/>
-                <w:sz w:val="16"/>
-                <w:szCs w:val="16"/>
-              </w:rPr>
-              <w:t>src</w:t>
-            </w:r>
-            <w:proofErr w:type="spellEnd"/>
-            <w:r>
-              <w:rPr>
-                <w:rFonts w:ascii="Arial" w:hAnsi="Arial" w:cs="Arial"/>
-                <w:sz w:val="16"/>
-                <w:szCs w:val="16"/>
-              </w:rPr>
-              <w:t xml:space="preserve"> MAC → </w:t>
-            </w:r>
-            <w:proofErr w:type="spellStart"/>
-            <w:r>
-              <w:rPr>
-                <w:rFonts w:ascii="Arial" w:hAnsi="Arial" w:cs="Arial"/>
-                <w:sz w:val="16"/>
-                <w:szCs w:val="16"/>
-              </w:rPr>
-              <w:t>src</w:t>
-            </w:r>
-            <w:proofErr w:type="spellEnd"/>
-            <w:r>
-              <w:rPr>
-                <w:rFonts w:ascii="Arial" w:hAnsi="Arial" w:cs="Arial"/>
-                <w:sz w:val="16"/>
-                <w:szCs w:val="16"/>
-              </w:rPr>
-              <w:t xml:space="preserve"> VTEP IP mapping</w:t>
+              <w:t>Learn src MAC → src VTEP IP mapping</w:t>
             </w:r>
           </w:p>
         </w:tc>
@@ -4334,23 +4208,13 @@
                 <w:szCs w:val="16"/>
               </w:rPr>
             </w:pPr>
-            <w:proofErr w:type="spellStart"/>
-            <w:r>
-              <w:rPr>
-                <w:rFonts w:ascii="Arial" w:hAnsi="Arial" w:cs="Arial"/>
-                <w:sz w:val="16"/>
-                <w:szCs w:val="16"/>
-              </w:rPr>
-              <w:t>multicast_ip</w:t>
-            </w:r>
-            <w:proofErr w:type="spellEnd"/>
-            <w:r>
-              <w:rPr>
-                <w:rFonts w:ascii="Arial" w:hAnsi="Arial" w:cs="Arial"/>
-                <w:sz w:val="16"/>
-                <w:szCs w:val="16"/>
-              </w:rPr>
-              <w:t xml:space="preserve"> field in VTEP, not used</w:t>
+            <w:r>
+              <w:rPr>
+                <w:rFonts w:ascii="Arial" w:hAnsi="Arial" w:cs="Arial"/>
+                <w:sz w:val="16"/>
+                <w:szCs w:val="16"/>
+              </w:rPr>
+              <w:t>multicast_ip field in VTEP, not used</w:t>
             </w:r>
           </w:p>
         </w:tc>
@@ -4589,23 +4453,13 @@
                 <w:szCs w:val="16"/>
               </w:rPr>
             </w:pPr>
-            <w:proofErr w:type="spellStart"/>
-            <w:r>
-              <w:rPr>
-                <w:rFonts w:ascii="Arial" w:hAnsi="Arial" w:cs="Arial"/>
-                <w:sz w:val="16"/>
-                <w:szCs w:val="16"/>
-              </w:rPr>
-              <w:t>Decap</w:t>
-            </w:r>
-            <w:proofErr w:type="spellEnd"/>
-            <w:r>
-              <w:rPr>
-                <w:rFonts w:ascii="Arial" w:hAnsi="Arial" w:cs="Arial"/>
-                <w:sz w:val="16"/>
-                <w:szCs w:val="16"/>
-              </w:rPr>
-              <w:t xml:space="preserve"> frames with inner VLAN SHOULD be discarded</w:t>
+            <w:r>
+              <w:rPr>
+                <w:rFonts w:ascii="Arial" w:hAnsi="Arial" w:cs="Arial"/>
+                <w:sz w:val="16"/>
+                <w:szCs w:val="16"/>
+              </w:rPr>
+              <w:t>Decap frames with inner VLAN SHOULD be discarded</w:t>
             </w:r>
           </w:p>
         </w:tc>
@@ -4909,34 +4763,14 @@
                 <w:szCs w:val="16"/>
               </w:rPr>
             </w:pPr>
-            <w:proofErr w:type="spellStart"/>
-            <w:r>
-              <w:rPr>
-                <w:rFonts w:ascii="Arial" w:hAnsi="Arial" w:cs="Arial"/>
-                <w:sz w:val="16"/>
-                <w:szCs w:val="16"/>
-              </w:rPr>
-              <w:t>Encap</w:t>
-            </w:r>
-            <w:proofErr w:type="spellEnd"/>
-            <w:r>
-              <w:rPr>
-                <w:rFonts w:ascii="Arial" w:hAnsi="Arial" w:cs="Arial"/>
-                <w:sz w:val="16"/>
-                <w:szCs w:val="16"/>
-              </w:rPr>
-              <w:t xml:space="preserve"> VTEP SHOULD strip VLAN before </w:t>
-            </w:r>
-            <w:proofErr w:type="spellStart"/>
-            <w:r>
-              <w:rPr>
-                <w:rFonts w:ascii="Arial" w:hAnsi="Arial" w:cs="Arial"/>
-                <w:sz w:val="16"/>
-                <w:szCs w:val="16"/>
-              </w:rPr>
-              <w:t>encap</w:t>
-            </w:r>
-            <w:proofErr w:type="spellEnd"/>
+            <w:r>
+              <w:rPr>
+                <w:rFonts w:ascii="Arial" w:hAnsi="Arial" w:cs="Arial"/>
+                <w:sz w:val="16"/>
+                <w:szCs w:val="16"/>
+              </w:rPr>
+              <w:t>Encap VTEP SHOULD strip VLAN before encap</w:t>
+            </w:r>
           </w:p>
         </w:tc>
         <w:tc>
@@ -5261,17 +5095,7 @@
           <w:szCs w:val="22"/>
         </w:rPr>
         <w:lastRenderedPageBreak/>
-        <w:t>COMPLETED</w:t>
-      </w:r>
-      <w:r>
-        <w:rPr>
-          <w:rFonts w:ascii="Arial" w:hAnsi="Arial" w:cs="Arial"/>
-          <w:b/>
-          <w:bCs/>
-          <w:sz w:val="22"/>
-          <w:szCs w:val="22"/>
-        </w:rPr>
-        <w:t>:</w:t>
+        <w:t>COMPLETED:</w:t>
       </w:r>
     </w:p>
     <w:p>
@@ -5316,45 +5140,6 @@
           <w:szCs w:val="22"/>
         </w:rPr>
         <w:t>TODO:</w:t>
-      </w:r>
-    </w:p>
-    <w:p>
-      <w:pPr>
-        <w:pStyle w:val="ListParagraph"/>
-        <w:numPr>
-          <w:ilvl w:val="0"/>
-          <w:numId w:val="19"/>
-        </w:numPr>
-        <w:spacing w:after="0" w:line="240" w:lineRule="auto"/>
-        <w:rPr>
-          <w:rFonts w:ascii="Arial" w:hAnsi="Arial" w:cs="Arial"/>
-          <w:sz w:val="18"/>
-          <w:szCs w:val="18"/>
-        </w:rPr>
-      </w:pPr>
-      <w:r>
-        <w:rPr>
-          <w:rFonts w:ascii="Arial" w:hAnsi="Arial" w:cs="Arial"/>
-          <w:sz w:val="18"/>
-          <w:szCs w:val="18"/>
-        </w:rPr>
-        <w:t xml:space="preserve">For full UDP checksum – </w:t>
-      </w:r>
-      <w:r>
-        <w:rPr>
-          <w:rFonts w:ascii="Arial" w:hAnsi="Arial" w:cs="Arial"/>
-          <w:sz w:val="18"/>
-          <w:szCs w:val="18"/>
-        </w:rPr>
-        <w:t xml:space="preserve">failed checksum drop handling </w:t>
-      </w:r>
-      <w:r>
-        <w:rPr>
-          <w:rFonts w:ascii="Arial" w:hAnsi="Arial" w:cs="Arial"/>
-          <w:sz w:val="18"/>
-          <w:szCs w:val="18"/>
-        </w:rPr>
-        <w:t>needed.</w:t>
       </w:r>
     </w:p>
     <w:p>
@@ -5487,7 +5272,39 @@
           <w:sz w:val="22"/>
           <w:szCs w:val="22"/>
         </w:rPr>
-        <w:t xml:space="preserve"> 13 (10 implemented, 3 not implemented)</w:t>
+        <w:t xml:space="preserve"> 1</w:t>
+      </w:r>
+      <w:r>
+        <w:rPr>
+          <w:rFonts w:ascii="Arial" w:hAnsi="Arial" w:cs="Arial"/>
+          <w:sz w:val="22"/>
+          <w:szCs w:val="22"/>
+        </w:rPr>
+        <w:t>4</w:t>
+      </w:r>
+      <w:r>
+        <w:rPr>
+          <w:rFonts w:ascii="Arial" w:hAnsi="Arial" w:cs="Arial"/>
+          <w:sz w:val="22"/>
+          <w:szCs w:val="22"/>
+        </w:rPr>
+        <w:t xml:space="preserve"> (10 implemented, </w:t>
+      </w:r>
+      <w:r>
+        <w:rPr>
+          <w:rFonts w:ascii="Arial" w:hAnsi="Arial" w:cs="Arial"/>
+          <w:sz w:val="22"/>
+          <w:szCs w:val="22"/>
+        </w:rPr>
+        <w:t>2</w:t>
+      </w:r>
+      <w:r>
+        <w:rPr>
+          <w:rFonts w:ascii="Arial" w:hAnsi="Arial" w:cs="Arial"/>
+          <w:sz w:val="22"/>
+          <w:szCs w:val="22"/>
+        </w:rPr>
+        <w:t xml:space="preserve"> not implemented)</w:t>
       </w:r>
     </w:p>
     <w:p>
@@ -5585,7 +5402,39 @@
           <w:sz w:val="20"/>
           <w:szCs w:val="20"/>
         </w:rPr>
-        <w:t>: 76% (22/29 requirements)</w:t>
+        <w:t xml:space="preserve">: </w:t>
+      </w:r>
+      <w:r>
+        <w:rPr>
+          <w:rFonts w:ascii="Arial" w:hAnsi="Arial" w:cs="Arial"/>
+          <w:sz w:val="20"/>
+          <w:szCs w:val="20"/>
+        </w:rPr>
+        <w:t>80</w:t>
+      </w:r>
+      <w:r>
+        <w:rPr>
+          <w:rFonts w:ascii="Arial" w:hAnsi="Arial" w:cs="Arial"/>
+          <w:sz w:val="20"/>
+          <w:szCs w:val="20"/>
+        </w:rPr>
+        <w:t>% (2</w:t>
+      </w:r>
+      <w:r>
+        <w:rPr>
+          <w:rFonts w:ascii="Arial" w:hAnsi="Arial" w:cs="Arial"/>
+          <w:sz w:val="20"/>
+          <w:szCs w:val="20"/>
+        </w:rPr>
+        <w:t>3</w:t>
+      </w:r>
+      <w:r>
+        <w:rPr>
+          <w:rFonts w:ascii="Arial" w:hAnsi="Arial" w:cs="Arial"/>
+          <w:sz w:val="20"/>
+          <w:szCs w:val="20"/>
+        </w:rPr>
+        <w:t>/29 requirements)</w:t>
       </w:r>
     </w:p>
     <w:p>
@@ -8959,6 +8808,7 @@
   <w:style w:type="character" w:default="1" w:styleId="DefaultParagraphFont">
     <w:name w:val="Default Paragraph Font"/>
     <w:uiPriority w:val="1"/>
+    <w:semiHidden/>
     <w:unhideWhenUsed/>
   </w:style>
   <w:style w:type="table" w:default="1" w:styleId="TableNormal">

</xml_diff>

<commit_message>
vlan tag included for VLAN gateway feature
</commit_message>
<xml_diff>
--- a/reference/RFC7348_VXLAN_Implementation_Status.docx
+++ b/reference/RFC7348_VXLAN_Implementation_Status.docx
@@ -4534,7 +4534,7 @@
                 <w:sz w:val="16"/>
                 <w:szCs w:val="16"/>
               </w:rPr>
-              <w:t>NO</w:t>
+              <w:t>YES</w:t>
             </w:r>
           </w:p>
         </w:tc>
@@ -4553,14 +4553,6 @@
                 <w:szCs w:val="16"/>
               </w:rPr>
             </w:pPr>
-            <w:r>
-              <w:rPr>
-                <w:rFonts w:ascii="Arial" w:hAnsi="Arial" w:cs="Arial"/>
-                <w:sz w:val="16"/>
-                <w:szCs w:val="16"/>
-              </w:rPr>
-              <w:t>Not implemented</w:t>
-            </w:r>
           </w:p>
         </w:tc>
       </w:tr>
@@ -4708,14 +4700,6 @@
                 <w:szCs w:val="16"/>
               </w:rPr>
             </w:pPr>
-            <w:r>
-              <w:rPr>
-                <w:rFonts w:ascii="Arial" w:hAnsi="Arial" w:cs="Arial"/>
-                <w:sz w:val="16"/>
-                <w:szCs w:val="16"/>
-              </w:rPr>
-              <w:t>Not adding VLAN tags</w:t>
-            </w:r>
           </w:p>
         </w:tc>
       </w:tr>
@@ -4844,7 +4828,7 @@
                 <w:sz w:val="16"/>
                 <w:szCs w:val="16"/>
               </w:rPr>
-              <w:t>NO</w:t>
+              <w:t>YES</w:t>
             </w:r>
           </w:p>
         </w:tc>
@@ -4863,14 +4847,6 @@
                 <w:szCs w:val="16"/>
               </w:rPr>
             </w:pPr>
-            <w:r>
-              <w:rPr>
-                <w:rFonts w:ascii="Arial" w:hAnsi="Arial" w:cs="Arial"/>
-                <w:sz w:val="16"/>
-                <w:szCs w:val="16"/>
-              </w:rPr>
-              <w:t>Not implemented (no VLAN handling)</w:t>
-            </w:r>
           </w:p>
         </w:tc>
       </w:tr>
@@ -5122,6 +5098,50 @@
     </w:p>
     <w:p>
       <w:pPr>
+        <w:pStyle w:val="ListParagraph"/>
+        <w:numPr>
+          <w:ilvl w:val="0"/>
+          <w:numId w:val="19"/>
+        </w:numPr>
+        <w:rPr>
+          <w:rFonts w:ascii="Arial" w:hAnsi="Arial" w:cs="Arial"/>
+          <w:sz w:val="18"/>
+          <w:szCs w:val="18"/>
+        </w:rPr>
+      </w:pPr>
+      <w:r>
+        <w:rPr>
+          <w:rFonts w:ascii="Arial" w:hAnsi="Arial" w:cs="Arial"/>
+          <w:sz w:val="18"/>
+          <w:szCs w:val="18"/>
+        </w:rPr>
+        <w:t>UDP checksum validation implemented</w:t>
+      </w:r>
+    </w:p>
+    <w:p>
+      <w:pPr>
+        <w:pStyle w:val="ListParagraph"/>
+        <w:numPr>
+          <w:ilvl w:val="0"/>
+          <w:numId w:val="19"/>
+        </w:numPr>
+        <w:rPr>
+          <w:rFonts w:ascii="Arial" w:hAnsi="Arial" w:cs="Arial"/>
+          <w:sz w:val="18"/>
+          <w:szCs w:val="18"/>
+        </w:rPr>
+      </w:pPr>
+      <w:r>
+        <w:rPr>
+          <w:rFonts w:ascii="Arial" w:hAnsi="Arial" w:cs="Arial"/>
+          <w:sz w:val="18"/>
+          <w:szCs w:val="18"/>
+        </w:rPr>
+        <w:t>Inner VLAN tag handling for VLAN Tag for VLAN Gateway feature</w:t>
+      </w:r>
+    </w:p>
+    <w:p>
+      <w:pPr>
         <w:spacing w:after="0" w:line="240" w:lineRule="auto"/>
         <w:rPr>
           <w:rFonts w:ascii="Arial" w:hAnsi="Arial" w:cs="Arial"/>
@@ -5163,29 +5183,6 @@
           <w:szCs w:val="18"/>
         </w:rPr>
         <w:t>For full BUM traffic support - Multicast support needed</w:t>
-      </w:r>
-    </w:p>
-    <w:p>
-      <w:pPr>
-        <w:pStyle w:val="ListParagraph"/>
-        <w:numPr>
-          <w:ilvl w:val="0"/>
-          <w:numId w:val="19"/>
-        </w:numPr>
-        <w:spacing w:after="0" w:line="240" w:lineRule="auto"/>
-        <w:rPr>
-          <w:rFonts w:ascii="Arial" w:hAnsi="Arial" w:cs="Arial"/>
-          <w:sz w:val="18"/>
-          <w:szCs w:val="18"/>
-        </w:rPr>
-      </w:pPr>
-      <w:r>
-        <w:rPr>
-          <w:rFonts w:ascii="Arial" w:hAnsi="Arial" w:cs="Arial"/>
-          <w:sz w:val="18"/>
-          <w:szCs w:val="18"/>
-        </w:rPr>
-        <w:t>For VXLAN gateway functionality - Inner VLAN handling needed.</w:t>
       </w:r>
     </w:p>
     <w:p>
@@ -5280,7 +5277,7 @@
           <w:sz w:val="22"/>
           <w:szCs w:val="22"/>
         </w:rPr>
-        <w:t>4</w:t>
+        <w:t>3</w:t>
       </w:r>
       <w:r>
         <w:rPr>
@@ -5288,7 +5285,7 @@
           <w:sz w:val="22"/>
           <w:szCs w:val="22"/>
         </w:rPr>
-        <w:t xml:space="preserve"> (10 implemented, </w:t>
+        <w:t xml:space="preserve"> (1</w:t>
       </w:r>
       <w:r>
         <w:rPr>
@@ -5296,7 +5293,23 @@
           <w:sz w:val="22"/>
           <w:szCs w:val="22"/>
         </w:rPr>
-        <w:t>2</w:t>
+        <w:t>3</w:t>
+      </w:r>
+      <w:r>
+        <w:rPr>
+          <w:rFonts w:ascii="Arial" w:hAnsi="Arial" w:cs="Arial"/>
+          <w:sz w:val="22"/>
+          <w:szCs w:val="22"/>
+        </w:rPr>
+        <w:t xml:space="preserve"> implemented, </w:t>
+      </w:r>
+      <w:r>
+        <w:rPr>
+          <w:rFonts w:ascii="Arial" w:hAnsi="Arial" w:cs="Arial"/>
+          <w:sz w:val="22"/>
+          <w:szCs w:val="22"/>
+        </w:rPr>
+        <w:t>0</w:t>
       </w:r>
       <w:r>
         <w:rPr>
@@ -5410,7 +5423,15 @@
           <w:sz w:val="20"/>
           <w:szCs w:val="20"/>
         </w:rPr>
-        <w:t>80</w:t>
+        <w:t>8</w:t>
+      </w:r>
+      <w:r>
+        <w:rPr>
+          <w:rFonts w:ascii="Arial" w:hAnsi="Arial" w:cs="Arial"/>
+          <w:sz w:val="20"/>
+          <w:szCs w:val="20"/>
+        </w:rPr>
+        <w:t>6</w:t>
       </w:r>
       <w:r>
         <w:rPr>
@@ -5426,7 +5447,7 @@
           <w:sz w:val="20"/>
           <w:szCs w:val="20"/>
         </w:rPr>
-        <w:t>3</w:t>
+        <w:t>5</w:t>
       </w:r>
       <w:r>
         <w:rPr>

</xml_diff>